<commit_message>
diskusjon og fullføre teori
</commit_message>
<xml_diff>
--- a/Lab 1/Laboppgave_V01_Diode AC.docx
+++ b/Lab 1/Laboppgave_V01_Diode AC.docx
@@ -63,6 +63,9 @@
                 <w:szCs w:val="28"/>
               </w:rPr>
             </w:pPr>
+            <w:r>
+              <w:t>|</w:t>
+            </w:r>
             <w:r>
               <w:fldChar w:fldCharType="begin"/>
             </w:r>
@@ -1950,7 +1953,7 @@
             <v:path o:extrusionok="f" gradientshapeok="t" o:connecttype="rect"/>
             <o:lock v:ext="edit" aspectratio="t"/>
           </v:shapetype>
-          <v:shape id="Picture 1" o:spid="_x0000_i1025" type="#_x0000_t75" style="width:172.5pt;height:74.5pt;visibility:visible;mso-wrap-style:square">
+          <v:shape id="Picture 1" o:spid="_x0000_i1025" type="#_x0000_t75" style="width:172.6pt;height:74.75pt;visibility:visible;mso-wrap-style:square">
             <v:imagedata r:id="rId8" o:title=""/>
           </v:shape>
         </w:pict>
@@ -2320,7 +2323,7 @@
     </w:p>
     <w:p>
       <w:pPr>
-        <w:pStyle w:val="ListParagraph"/>
+        <w:pStyle w:val="Listeavsnitt"/>
         <w:rPr>
           <w:sz w:val="24"/>
         </w:rPr>
@@ -2546,7 +2549,7 @@
           <w:sz w:val="24"/>
         </w:rPr>
         <w:pict w14:anchorId="3A46F5A5">
-          <v:shape id="_x0000_i1026" type="#_x0000_t75" style="width:230pt;height:134.5pt">
+          <v:shape id="_x0000_i1026" type="#_x0000_t75" style="width:229.85pt;height:134.3pt">
             <v:imagedata r:id="rId9" o:title="" cropbottom="10295f"/>
           </v:shape>
         </w:pict>
@@ -2821,7 +2824,7 @@
       </w:pPr>
       <w:r>
         <w:pict w14:anchorId="54C4ED8E">
-          <v:shape id="_x0000_i1027" type="#_x0000_t75" style="width:274.5pt;height:129.5pt" o:allowincell="f" o:allowoverlap="f">
+          <v:shape id="_x0000_i1027" type="#_x0000_t75" style="width:274.6pt;height:129.7pt" o:allowincell="f" o:allowoverlap="f">
             <v:imagedata r:id="rId10" o:title="" croptop="2175f" cropbottom="4623f" cropleft="558f" cropright="1116f"/>
           </v:shape>
         </w:pict>
@@ -3115,7 +3118,7 @@
           <w:noProof/>
         </w:rPr>
         <w:pict w14:anchorId="482BE870">
-          <v:shape id="_x0000_i1028" type="#_x0000_t75" style="width:267pt;height:188.5pt;visibility:visible;mso-wrap-style:square">
+          <v:shape id="_x0000_i1028" type="#_x0000_t75" style="width:267.25pt;height:188.3pt;visibility:visible;mso-wrap-style:square">
             <v:imagedata r:id="rId11" o:title=""/>
           </v:shape>
         </w:pict>
@@ -3876,7 +3879,7 @@
           <w:sz w:val="24"/>
         </w:rPr>
         <w:pict w14:anchorId="6F50FBBE">
-          <v:shape id="_x0000_i1029" type="#_x0000_t75" style="width:242.5pt;height:135.5pt">
+          <v:shape id="_x0000_i1029" type="#_x0000_t75" style="width:242.75pt;height:135.7pt">
             <v:imagedata r:id="rId13" o:title=""/>
           </v:shape>
         </w:pict>
@@ -4295,7 +4298,7 @@
     </w:p>
     <w:p>
       <w:pPr>
-        <w:pStyle w:val="ListParagraph"/>
+        <w:pStyle w:val="Listeavsnitt"/>
         <w:rPr>
           <w:sz w:val="24"/>
         </w:rPr>
@@ -4355,7 +4358,7 @@
           <w:sz w:val="24"/>
         </w:rPr>
         <w:pict w14:anchorId="25EA9043">
-          <v:shape id="_x0000_i1030" type="#_x0000_t75" style="width:279.5pt;height:154.5pt">
+          <v:shape id="_x0000_i1030" type="#_x0000_t75" style="width:279.7pt;height:154.6pt">
             <v:imagedata r:id="rId14" o:title=""/>
           </v:shape>
         </w:pict>
@@ -4988,7 +4991,7 @@
     </w:p>
     <w:p>
       <w:pPr>
-        <w:pStyle w:val="BodyText"/>
+        <w:pStyle w:val="Brdtekst"/>
       </w:pPr>
     </w:p>
     <w:sectPr>
@@ -5025,7 +5028,7 @@
 <w:ftr xmlns:wpc="http://schemas.microsoft.com/office/word/2010/wordprocessingCanvas" xmlns:cx="http://schemas.microsoft.com/office/drawing/2014/chartex" xmlns:cx1="http://schemas.microsoft.com/office/drawing/2015/9/8/chartex" xmlns:cx2="http://schemas.microsoft.com/office/drawing/2015/10/21/chartex" xmlns:cx3="http://schemas.microsoft.com/office/drawing/2016/5/9/chartex" xmlns:cx4="http://schemas.microsoft.com/office/drawing/2016/5/10/chartex" xmlns:cx5="http://schemas.microsoft.com/office/drawing/2016/5/11/chartex" xmlns:cx6="http://schemas.microsoft.com/office/drawing/2016/5/12/chartex" xmlns:cx7="http://schemas.microsoft.com/office/drawing/2016/5/13/chartex" xmlns:cx8="http://schemas.microsoft.com/office/drawing/2016/5/14/chartex" xmlns:mc="http://schemas.openxmlformats.org/markup-compatibility/2006" xmlns:aink="http://schemas.microsoft.com/office/drawing/2016/ink" xmlns:am3d="http://schemas.microsoft.com/office/drawing/2017/model3d" xmlns:o="urn:schemas-microsoft-com:office:office" xmlns:oel="http://schemas.microsoft.com/office/2019/extlst" xmlns:r="http://schemas.openxmlformats.org/officeDocument/2006/relationships" xmlns:m="http://schemas.openxmlformats.org/officeDocument/2006/math" xmlns:v="urn:schemas-microsoft-com:vml" xmlns:wp14="http://schemas.microsoft.com/office/word/2010/wordprocessingDrawing" xmlns:wp="http://schemas.openxmlformats.org/drawingml/2006/wordprocessingDrawing" xmlns:w10="urn:schemas-microsoft-com:office:word" xmlns:w="http://schemas.openxmlformats.org/wordprocessingml/2006/main" xmlns:w14="http://schemas.microsoft.com/office/word/2010/wordml" xmlns:w15="http://schemas.microsoft.com/office/word/2012/wordml" xmlns:w16cex="http://schemas.microsoft.com/office/word/2018/wordml/cex" xmlns:w16cid="http://schemas.microsoft.com/office/word/2016/wordml/cid" xmlns:w16="http://schemas.microsoft.com/office/word/2018/wordml" xmlns:w16du="http://schemas.microsoft.com/office/word/2023/wordml/word16du" xmlns:w16sdtdh="http://schemas.microsoft.com/office/word/2020/wordml/sdtdatahash" xmlns:w16sdtfl="http://schemas.microsoft.com/office/word/2024/wordml/sdtformatlock" xmlns:w16se="http://schemas.microsoft.com/office/word/2015/wordml/symex" xmlns:wpg="http://schemas.microsoft.com/office/word/2010/wordprocessingGroup" xmlns:wpi="http://schemas.microsoft.com/office/word/2010/wordprocessingInk" xmlns:wne="http://schemas.microsoft.com/office/word/2006/wordml" xmlns:wps="http://schemas.microsoft.com/office/word/2010/wordprocessingShape" mc:Ignorable="w14 w15 w16se w16cid w16 w16cex w16sdtdh w16sdtfl w16du wp14">
   <w:p>
     <w:pPr>
-      <w:pStyle w:val="Footer"/>
+      <w:pStyle w:val="Bunntekst"/>
       <w:pBdr>
         <w:top w:val="single" w:sz="12" w:space="0" w:color="auto"/>
       </w:pBdr>
@@ -5074,7 +5077,7 @@
     </w:r>
     <w:r>
       <w:rPr>
-        <w:rStyle w:val="PageNumber"/>
+        <w:rStyle w:val="Sidetall"/>
         <w:i/>
         <w:iCs/>
         <w:noProof/>
@@ -5083,21 +5086,21 @@
     </w:r>
     <w:r>
       <w:rPr>
-        <w:rStyle w:val="PageNumber"/>
+        <w:rStyle w:val="Sidetall"/>
         <w:i/>
       </w:rPr>
       <w:instrText xml:space="preserve"> PAGE </w:instrText>
     </w:r>
     <w:r>
       <w:rPr>
-        <w:rStyle w:val="PageNumber"/>
+        <w:rStyle w:val="Sidetall"/>
         <w:i/>
       </w:rPr>
       <w:fldChar w:fldCharType="separate"/>
     </w:r>
     <w:r>
       <w:rPr>
-        <w:rStyle w:val="PageNumber"/>
+        <w:rStyle w:val="Sidetall"/>
         <w:i/>
         <w:iCs/>
         <w:noProof/>
@@ -5106,7 +5109,7 @@
     </w:r>
     <w:r>
       <w:rPr>
-        <w:rStyle w:val="PageNumber"/>
+        <w:rStyle w:val="Sidetall"/>
         <w:i/>
         <w:iCs/>
         <w:noProof/>
@@ -5130,7 +5133,7 @@
   </w:p>
   <w:p>
     <w:pPr>
-      <w:pStyle w:val="Footer"/>
+      <w:pStyle w:val="Bunntekst"/>
     </w:pPr>
   </w:p>
 </w:ftr>
@@ -5159,7 +5162,7 @@
 <w:hdr xmlns:wpc="http://schemas.microsoft.com/office/word/2010/wordprocessingCanvas" xmlns:cx="http://schemas.microsoft.com/office/drawing/2014/chartex" xmlns:cx1="http://schemas.microsoft.com/office/drawing/2015/9/8/chartex" xmlns:cx2="http://schemas.microsoft.com/office/drawing/2015/10/21/chartex" xmlns:cx3="http://schemas.microsoft.com/office/drawing/2016/5/9/chartex" xmlns:cx4="http://schemas.microsoft.com/office/drawing/2016/5/10/chartex" xmlns:cx5="http://schemas.microsoft.com/office/drawing/2016/5/11/chartex" xmlns:cx6="http://schemas.microsoft.com/office/drawing/2016/5/12/chartex" xmlns:cx7="http://schemas.microsoft.com/office/drawing/2016/5/13/chartex" xmlns:cx8="http://schemas.microsoft.com/office/drawing/2016/5/14/chartex" xmlns:mc="http://schemas.openxmlformats.org/markup-compatibility/2006" xmlns:aink="http://schemas.microsoft.com/office/drawing/2016/ink" xmlns:am3d="http://schemas.microsoft.com/office/drawing/2017/model3d" xmlns:o="urn:schemas-microsoft-com:office:office" xmlns:oel="http://schemas.microsoft.com/office/2019/extlst" xmlns:r="http://schemas.openxmlformats.org/officeDocument/2006/relationships" xmlns:m="http://schemas.openxmlformats.org/officeDocument/2006/math" xmlns:v="urn:schemas-microsoft-com:vml" xmlns:wp14="http://schemas.microsoft.com/office/word/2010/wordprocessingDrawing" xmlns:wp="http://schemas.openxmlformats.org/drawingml/2006/wordprocessingDrawing" xmlns:w10="urn:schemas-microsoft-com:office:word" xmlns:w="http://schemas.openxmlformats.org/wordprocessingml/2006/main" xmlns:w14="http://schemas.microsoft.com/office/word/2010/wordml" xmlns:w15="http://schemas.microsoft.com/office/word/2012/wordml" xmlns:w16cex="http://schemas.microsoft.com/office/word/2018/wordml/cex" xmlns:w16cid="http://schemas.microsoft.com/office/word/2016/wordml/cid" xmlns:w16="http://schemas.microsoft.com/office/word/2018/wordml" xmlns:w16du="http://schemas.microsoft.com/office/word/2023/wordml/word16du" xmlns:w16sdtdh="http://schemas.microsoft.com/office/word/2020/wordml/sdtdatahash" xmlns:w16sdtfl="http://schemas.microsoft.com/office/word/2024/wordml/sdtformatlock" xmlns:w16se="http://schemas.microsoft.com/office/word/2015/wordml/symex" xmlns:wpg="http://schemas.microsoft.com/office/word/2010/wordprocessingGroup" xmlns:wpi="http://schemas.microsoft.com/office/word/2010/wordprocessingInk" xmlns:wne="http://schemas.microsoft.com/office/word/2006/wordml" xmlns:wps="http://schemas.microsoft.com/office/word/2010/wordprocessingShape" mc:Ignorable="w14 w15 w16se w16cid w16 w16cex w16sdtdh w16sdtfl w16du wp14">
   <w:p>
     <w:pPr>
-      <w:pStyle w:val="Heading2"/>
+      <w:pStyle w:val="Overskrift2"/>
       <w:tabs>
         <w:tab w:val="left" w:pos="1035"/>
       </w:tabs>
@@ -5199,7 +5202,7 @@
   </w:p>
   <w:p>
     <w:pPr>
-      <w:pStyle w:val="Heading2"/>
+      <w:pStyle w:val="Overskrift2"/>
       <w:tabs>
         <w:tab w:val="left" w:pos="1035"/>
       </w:tabs>
@@ -5214,7 +5217,7 @@
   </w:p>
   <w:p>
     <w:pPr>
-      <w:pStyle w:val="Heading2"/>
+      <w:pStyle w:val="Overskrift2"/>
       <w:tabs>
         <w:tab w:val="left" w:pos="1035"/>
       </w:tabs>
@@ -5223,7 +5226,7 @@
   </w:p>
   <w:p>
     <w:pPr>
-      <w:pStyle w:val="Heading2"/>
+      <w:pStyle w:val="Overskrift2"/>
       <w:tabs>
         <w:tab w:val="left" w:pos="1035"/>
       </w:tabs>
@@ -5232,7 +5235,7 @@
   </w:p>
   <w:p>
     <w:pPr>
-      <w:pStyle w:val="Heading2"/>
+      <w:pStyle w:val="Overskrift2"/>
       <w:tabs>
         <w:tab w:val="left" w:pos="1560"/>
       </w:tabs>
@@ -5277,7 +5280,7 @@
   </w:p>
   <w:p>
     <w:pPr>
-      <w:pStyle w:val="Heading2"/>
+      <w:pStyle w:val="Overskrift2"/>
       <w:tabs>
         <w:tab w:val="left" w:pos="1560"/>
       </w:tabs>
@@ -5350,7 +5353,7 @@
         <w:szCs w:val="22"/>
         <w:lang w:val="nb-NO"/>
       </w:rPr>
-      <w:t>17. mar. 2026</w:t>
+      <w:t>12. apr. 2026</w:t>
     </w:r>
     <w:r>
       <w:fldChar w:fldCharType="end"/>
@@ -5373,7 +5376,7 @@
   </w:p>
   <w:p>
     <w:pPr>
-      <w:pStyle w:val="Heading2"/>
+      <w:pStyle w:val="Overskrift2"/>
       <w:tabs>
         <w:tab w:val="left" w:pos="1035"/>
       </w:tabs>
@@ -5390,7 +5393,7 @@
   </w:p>
   <w:p>
     <w:pPr>
-      <w:pStyle w:val="Heading2"/>
+      <w:pStyle w:val="Overskrift2"/>
     </w:pPr>
     <w:r>
       <w:rPr>
@@ -6515,7 +6518,7 @@
       <w:lang w:eastAsia="en-US"/>
     </w:rPr>
   </w:style>
-  <w:style w:type="paragraph" w:styleId="Heading1">
+  <w:style w:type="paragraph" w:styleId="Overskrift1">
     <w:name w:val="heading 1"/>
     <w:basedOn w:val="Normal"/>
     <w:next w:val="Normal"/>
@@ -6549,11 +6552,11 @@
       <w:sz w:val="24"/>
     </w:rPr>
   </w:style>
-  <w:style w:type="paragraph" w:styleId="Heading2">
+  <w:style w:type="paragraph" w:styleId="Overskrift2">
     <w:name w:val="heading 2"/>
     <w:basedOn w:val="Normal"/>
     <w:next w:val="Normal"/>
-    <w:link w:val="Heading2Char"/>
+    <w:link w:val="Overskrift2Tegn"/>
     <w:qFormat/>
     <w:pPr>
       <w:keepNext/>
@@ -6571,7 +6574,7 @@
       <w:lang w:val="en-US"/>
     </w:rPr>
   </w:style>
-  <w:style w:type="paragraph" w:styleId="Heading3">
+  <w:style w:type="paragraph" w:styleId="Overskrift3">
     <w:name w:val="heading 3"/>
     <w:basedOn w:val="Normal"/>
     <w:next w:val="Normal"/>
@@ -6586,13 +6589,13 @@
       <w:u w:val="single"/>
     </w:rPr>
   </w:style>
-  <w:style w:type="character" w:default="1" w:styleId="DefaultParagraphFont">
+  <w:style w:type="character" w:default="1" w:styleId="Standardskriftforavsnitt">
     <w:name w:val="Default Paragraph Font"/>
     <w:uiPriority w:val="1"/>
     <w:semiHidden/>
     <w:unhideWhenUsed/>
   </w:style>
-  <w:style w:type="table" w:default="1" w:styleId="TableNormal">
+  <w:style w:type="table" w:default="1" w:styleId="Vanligtabell">
     <w:name w:val="Normal Table"/>
     <w:uiPriority w:val="99"/>
     <w:semiHidden/>
@@ -6607,13 +6610,13 @@
       </w:tblCellMar>
     </w:tblPr>
   </w:style>
-  <w:style w:type="numbering" w:default="1" w:styleId="NoList">
+  <w:style w:type="numbering" w:default="1" w:styleId="Ingenliste">
     <w:name w:val="No List"/>
     <w:uiPriority w:val="99"/>
     <w:semiHidden/>
     <w:unhideWhenUsed/>
   </w:style>
-  <w:style w:type="paragraph" w:styleId="BodyTextIndent">
+  <w:style w:type="paragraph" w:styleId="Brdtekstinnrykk">
     <w:name w:val="Body Text Indent"/>
     <w:basedOn w:val="Normal"/>
     <w:pPr>
@@ -6644,14 +6647,14 @@
       <w:sz w:val="24"/>
     </w:rPr>
   </w:style>
-  <w:style w:type="paragraph" w:styleId="BodyText">
+  <w:style w:type="paragraph" w:styleId="Brdtekst">
     <w:name w:val="Body Text"/>
     <w:basedOn w:val="Normal"/>
     <w:rPr>
       <w:sz w:val="24"/>
     </w:rPr>
   </w:style>
-  <w:style w:type="paragraph" w:styleId="Header">
+  <w:style w:type="paragraph" w:styleId="Topptekst">
     <w:name w:val="header"/>
     <w:basedOn w:val="Normal"/>
     <w:pPr>
@@ -6661,7 +6664,7 @@
       </w:tabs>
     </w:pPr>
   </w:style>
-  <w:style w:type="paragraph" w:styleId="Footer">
+  <w:style w:type="paragraph" w:styleId="Bunntekst">
     <w:name w:val="footer"/>
     <w:basedOn w:val="Normal"/>
     <w:pPr>
@@ -6671,11 +6674,11 @@
       </w:tabs>
     </w:pPr>
   </w:style>
-  <w:style w:type="character" w:styleId="PageNumber">
+  <w:style w:type="character" w:styleId="Sidetall">
     <w:name w:val="page number"/>
-    <w:basedOn w:val="DefaultParagraphFont"/>
+    <w:basedOn w:val="Standardskriftforavsnitt"/>
   </w:style>
-  <w:style w:type="paragraph" w:styleId="BodyTextIndent2">
+  <w:style w:type="paragraph" w:styleId="Brdtekstinnrykk2">
     <w:name w:val="Body Text Indent 2"/>
     <w:basedOn w:val="Normal"/>
     <w:pPr>
@@ -6689,7 +6692,7 @@
       <w:sz w:val="24"/>
     </w:rPr>
   </w:style>
-  <w:style w:type="paragraph" w:styleId="BodyTextIndent3">
+  <w:style w:type="paragraph" w:styleId="Brdtekstinnrykk3">
     <w:name w:val="Body Text Indent 3"/>
     <w:basedOn w:val="Normal"/>
     <w:pPr>
@@ -6701,7 +6704,7 @@
       <w:iCs/>
     </w:rPr>
   </w:style>
-  <w:style w:type="character" w:styleId="CommentReference">
+  <w:style w:type="character" w:styleId="Merknadsreferanse">
     <w:name w:val="annotation reference"/>
     <w:semiHidden/>
     <w:rPr>
@@ -6709,22 +6712,22 @@
       <w:szCs w:val="16"/>
     </w:rPr>
   </w:style>
-  <w:style w:type="paragraph" w:styleId="CommentText">
+  <w:style w:type="paragraph" w:styleId="Merknadstekst">
     <w:name w:val="annotation text"/>
     <w:basedOn w:val="Normal"/>
     <w:semiHidden/>
   </w:style>
-  <w:style w:type="paragraph" w:styleId="CommentSubject">
+  <w:style w:type="paragraph" w:styleId="Kommentaremne">
     <w:name w:val="annotation subject"/>
-    <w:basedOn w:val="CommentText"/>
-    <w:next w:val="CommentText"/>
+    <w:basedOn w:val="Merknadstekst"/>
+    <w:next w:val="Merknadstekst"/>
     <w:semiHidden/>
     <w:rPr>
       <w:b/>
       <w:bCs/>
     </w:rPr>
   </w:style>
-  <w:style w:type="paragraph" w:styleId="BalloonText">
+  <w:style w:type="paragraph" w:styleId="Bobletekst">
     <w:name w:val="Balloon Text"/>
     <w:basedOn w:val="Normal"/>
     <w:semiHidden/>
@@ -6734,16 +6737,16 @@
       <w:szCs w:val="16"/>
     </w:rPr>
   </w:style>
-  <w:style w:type="character" w:customStyle="1" w:styleId="Heading2Char">
-    <w:name w:val="Heading 2 Char"/>
-    <w:link w:val="Heading2"/>
+  <w:style w:type="character" w:customStyle="1" w:styleId="Overskrift2Tegn">
+    <w:name w:val="Overskrift 2 Tegn"/>
+    <w:link w:val="Overskrift2"/>
     <w:rsid w:val="00B81C38"/>
     <w:rPr>
       <w:i/>
       <w:lang w:val="en-US" w:eastAsia="en-US"/>
     </w:rPr>
   </w:style>
-  <w:style w:type="paragraph" w:styleId="ListParagraph">
+  <w:style w:type="paragraph" w:styleId="Listeavsnitt">
     <w:name w:val="List Paragraph"/>
     <w:basedOn w:val="Normal"/>
     <w:uiPriority w:val="34"/>

</xml_diff>